<commit_message>
docs: update spec, manual, and permissions for recent features
Add documentation for public dashboard & reports, broadcast day boundary
markers, configurable discovery default tier, and report filename
conventions across all doc files.

Co-Authored-By: Claude Opus 4.6 <noreply@anthropic.com>
</commit_message>
<xml_diff>
--- a/Clutch_Viewership_Tracker_Spec_v1.docx
+++ b/Clutch_Viewership_Tracker_Spec_v1.docx
@@ -7058,7 +7058,7 @@
           <w:sz w:val="22"/>
           <w:szCs w:val="22"/>
         </w:rPr>
-        <w:t xml:space="preserve">New channels are added to the event with source=auto_discovered and tier=community (default).</w:t>
+        <w:t xml:space="preserve">New channels are added to the event with source=auto_discovered and a configurable default tier (set per series in the series editor; defaults to “community” if not configured).</w:t>
       </w:r>
     </w:p>
     <w:p>
@@ -8252,7 +8252,57 @@
           <w:sz w:val="28"/>
           <w:szCs w:val="28"/>
         </w:rPr>
-        <w:t xml:space="preserve">6.5 Discord Bot Integration (Future)</w:t>
+        <w:t xml:space="preserve">6.5 Public Dashboard</w:t>
+      </w:r>
+    </w:p>
+    <w:p>
+      <w:pPr>
+        <w:spacing w:after="120" w:line="276"/>
+      </w:pPr>
+      <w:r>
+        <w:rPr>
+          <w:rFonts w:ascii="Arial" w:cs="Arial" w:eastAsia="Arial" w:hAnsi="Arial"/>
+          <w:color w:val="333333"/>
+          <w:sz w:val="22"/>
+          <w:szCs w:val="22"/>
+        </w:rPr>
+        <w:t xml:space="preserve">Individual series can be made publicly accessible by enabling the “Public” toggle in the series editor. When enabled, a stripped-down, read-only version of the dashboard is available at /public/{short_name} without requiring authentication. The public dashboard includes all viewer-facing panels (summary bar, total CCV, platform breakdown, time series chart, channel leaderboard, language and region distribution) with live real-time updates via anonymous WebSocket connections. Management features (sidebar, channel editing, discovery feed, export, polling controls) are excluded.</w:t>
+      </w:r>
+    </w:p>
+    <w:p>
+      <w:pPr>
+        <w:spacing w:after="120" w:line="276"/>
+      </w:pPr>
+      <w:r>
+        <w:rPr>
+          <w:rFonts w:ascii="Arial" w:cs="Arial" w:eastAsia="Arial" w:hAnsi="Arial"/>
+          <w:color w:val="333333"/>
+          <w:sz w:val="22"/>
+          <w:szCs w:val="22"/>
+        </w:rPr>
+        <w:t xml:space="preserve">Public access extends to generated reports. HTML reports for public series are accessible at /api/public/{short_name}/reports/{filename} without authentication. Report filenames follow the convention: day_{broadcast-day-date}.html for broadcast day reports (e.g., day_2026-03-07.html), stage_{stage-name}.html for stage reports, and series_{date}.html for series-level reports. Only series with the public toggle enabled expose these endpoints; all other series return 404.</w:t>
+      </w:r>
+    </w:p>
+    <w:p>
+      <w:pPr>
+        <w:spacing w:before="100" w:after="0"/>
+      </w:pPr>
+    </w:p>
+    <w:p>
+      <w:pPr>
+        <w:pStyle w:val="Heading2"/>
+        <w:spacing w:before="300" w:after="150"/>
+      </w:pPr>
+      <w:r>
+        <w:rPr>
+          <w:rFonts w:ascii="Arial" w:cs="Arial" w:eastAsia="Arial" w:hAnsi="Arial"/>
+          <w:b/>
+          <w:bCs/>
+          <w:color w:val="1A1A2E"/>
+          <w:sz w:val="28"/>
+          <w:szCs w:val="28"/>
+        </w:rPr>
+        <w:t xml:space="preserve">6.6 Discord Bot Integration (Future)</w:t>
       </w:r>
     </w:p>
     <w:p>
@@ -8529,7 +8579,7 @@
           <w:sz w:val="22"/>
           <w:szCs w:val="22"/>
         </w:rPr>
-        <w:t xml:space="preserve">Vertical markers for key moments (match start, halftime, finals) if configured in event metadata.</w:t>
+        <w:t xml:space="preserve">Vertical markers for key moments (match start, halftime, finals) if configured in event metadata. When viewing multiple broadcast days, vertical dashed lines with day labels are automatically rendered at each broadcast day’s start to indicate day boundaries.</w:t>
       </w:r>
     </w:p>
     <w:p>
@@ -13311,7 +13361,7 @@
           <w:sz w:val="22"/>
           <w:szCs w:val="22"/>
         </w:rPr>
-        <w:t xml:space="preserve">Output: Final report is saved to the configured output location (local file system, S3 bucket, or Google Drive). Optionally emailed to configured recipients.</w:t>
+        <w:t xml:space="preserve">Output: Final report is saved to the configured output location (local file system, S3 bucket, or Google Drive). Optionally emailed to configured recipients. Report filenames are generated based on scope: day_{broadcast-day-date} for broadcast day reports, stage_{stage-name} for stage reports, and series_{date} for series reports. For public series, reports are also accessible without authentication via the public API.</w:t>
       </w:r>
     </w:p>
     <w:p>
@@ -13979,7 +14029,7 @@
           <w:sz w:val="22"/>
           <w:szCs w:val="22"/>
         </w:rPr>
-        <w:t xml:space="preserve">Time-series charts include event moment annotations (e.g., “Match 1 Start”, “Grand Finals”) if configured in the event metadata.</w:t>
+        <w:t xml:space="preserve">Time-series charts include event moment annotations (e.g., “Match 1 Start”, “Grand Finals”) if configured in the event metadata. Multi-day reports include vertical dashed day boundary markers using the Chart.js annotation plugin.</w:t>
       </w:r>
     </w:p>
     <w:p>
@@ -14209,7 +14259,7 @@
           <w:sz w:val="22"/>
           <w:szCs w:val="22"/>
         </w:rPr>
-        <w:t xml:space="preserve">A read-only web view where partners can log in and view their event reports and historical data. Reduces the need to email reports manually.</w:t>
+        <w:t xml:space="preserve">A read-only web view where partners can log in and view their event reports and historical data. Reduces the need to email reports manually. (Partially implemented: the public dashboard feature in Section 6.5 provides unauthenticated read-only access to series dashboards and reports via direct links.)</w:t>
       </w:r>
     </w:p>
     <w:p>

</xml_diff>